<commit_message>
Publish final 100-slide course preview
</commit_message>
<xml_diff>
--- a/downloads/linux-foundations-theory-reader.docx
+++ b/downloads/linux-foundations-theory-reader.docx
@@ -42,7 +42,7 @@
           <w:color w:val="675F6C"/>
           <w:sz w:val="21"/>
         </w:rPr>
-        <w:t>Course companion · English edition · 98-slide workshop</w:t>
+        <w:t>Course companion · English edition · 100-slide workshop</w:t>
       </w:r>
     </w:p>
     <w:tbl>
@@ -80,7 +80,7 @@
                 <w:color w:val="E25B5B"/>
                 <w:sz w:val="36"/>
               </w:rPr>
-              <w:t>8</w:t>
+              <w:t>10</w:t>
               <w:br/>
             </w:r>
             <w:r>
@@ -90,7 +90,7 @@
                 <w:color w:val="471D4F"/>
                 <w:sz w:val="17"/>
               </w:rPr>
-              <w:t>theory chapters</w:t>
+              <w:t>core chapters</w:t>
             </w:r>
           </w:p>
         </w:tc>
@@ -117,7 +117,7 @@
                 <w:color w:val="E25B5B"/>
                 <w:sz w:val="36"/>
               </w:rPr>
-              <w:t>20</w:t>
+              <w:t>23</w:t>
               <w:br/>
             </w:r>
             <w:r>
@@ -196,7 +196,7 @@
           <w:color w:val="675F6C"/>
           <w:sz w:val="19"/>
         </w:rPr>
-        <w:t>Technical review completed 18 July 2026</w:t>
+        <w:t>Technical review completed 19 July 2026</w:t>
         <w:br/>
         <w:t>Ubuntu 24.04 classroom baseline · portable concepts marked explicitly</w:t>
       </w:r>
@@ -213,7 +213,7 @@
           <w:b/>
           <w:color w:val="221D27"/>
         </w:rPr>
-        <w:t>Course companion · English edition · verified 18 July 2026</w:t>
+        <w:t>Course companion · English edition · verified 19 July 2026</w:t>
       </w:r>
     </w:p>
     <w:p>
@@ -222,7 +222,7 @@
           <w:rFonts w:ascii="Aptos" w:hAnsi="Aptos"/>
           <w:color w:val="221D27"/>
         </w:rPr>
-        <w:t>This reader expands the theory behind the 98-slide Linux Foundations workshop. It is written for learners using an Ubuntu 24.04 classroom VM or Incus system container, while clearly marking behavior that differs by distribution, shell, or local policy. Commands are examples to inspect and discuss; make changes only in the course lab environment.</w:t>
+        <w:t>This reader expands the theory behind the 100-slide Linux Foundations workshop. It is written for learners using an Ubuntu 24.04 classroom VM or Incus system container, while clearly marking behavior that differs by distribution, shell, or local policy. Commands are examples to inspect and discuss; make changes only in the course lab environment.</w:t>
       </w:r>
     </w:p>
     <w:p>
@@ -239,7 +239,7 @@
           <w:rFonts w:ascii="Aptos" w:hAnsi="Aptos"/>
           <w:color w:val="221D27"/>
         </w:rPr>
-        <w:t>Read Chapters 1–8 in order before the workshop, or use the command index and references afterward. Each chapter follows one operational loop:</w:t>
+        <w:t>Read Chapters 1–10 in order before the workshop, or use the command index and references afterward. Each chapter follows one operational loop:</w:t>
       </w:r>
     </w:p>
     <w:p>
@@ -411,11 +411,6 @@
           <w:color w:val="471D4F"/>
         </w:rPr>
         <w:t>, and normally add SELinux policy as another access-control layer.</w:t>
-      </w:r>
-    </w:p>
-    <w:p>
-      <w:r>
-        <w:br w:type="page"/>
       </w:r>
     </w:p>
     <w:p>
@@ -660,11 +655,6 @@
       </w:r>
     </w:p>
     <w:p>
-      <w:r>
-        <w:br w:type="page"/>
-      </w:r>
-    </w:p>
-    <w:p>
       <w:pPr>
         <w:pStyle w:val="Heading1"/>
       </w:pPr>
@@ -1518,8 +1508,16 @@
     </w:p>
     <w:p>
       <w:pPr>
-        <w:pStyle w:val="ListNumber"/>
-      </w:pPr>
+        <w:spacing w:after="80"/>
+        <w:ind w:left="547" w:hanging="274"/>
+      </w:pPr>
+      <w:r>
+        <w:rPr>
+          <w:rFonts w:ascii="Aptos" w:hAnsi="Aptos"/>
+          <w:color w:val="221D27"/>
+        </w:rPr>
+        <w:t xml:space="preserve">1. </w:t>
+      </w:r>
       <w:r>
         <w:rPr>
           <w:rFonts w:ascii="Aptos" w:hAnsi="Aptos"/>
@@ -1575,8 +1573,16 @@
     </w:p>
     <w:p>
       <w:pPr>
-        <w:pStyle w:val="ListNumber"/>
-      </w:pPr>
+        <w:spacing w:after="80"/>
+        <w:ind w:left="547" w:hanging="274"/>
+      </w:pPr>
+      <w:r>
+        <w:rPr>
+          <w:rFonts w:ascii="Aptos" w:hAnsi="Aptos"/>
+          <w:color w:val="221D27"/>
+        </w:rPr>
+        <w:t xml:space="preserve">2. </w:t>
+      </w:r>
       <w:r>
         <w:rPr>
           <w:rFonts w:ascii="Aptos" w:hAnsi="Aptos"/>
@@ -1617,8 +1623,16 @@
     </w:p>
     <w:p>
       <w:pPr>
-        <w:pStyle w:val="ListNumber"/>
-      </w:pPr>
+        <w:spacing w:after="80"/>
+        <w:ind w:left="547" w:hanging="274"/>
+      </w:pPr>
+      <w:r>
+        <w:rPr>
+          <w:rFonts w:ascii="Aptos" w:hAnsi="Aptos"/>
+          <w:color w:val="221D27"/>
+        </w:rPr>
+        <w:t xml:space="preserve">3. </w:t>
+      </w:r>
       <w:r>
         <w:rPr>
           <w:rFonts w:ascii="Aptos" w:hAnsi="Aptos"/>
@@ -1629,8 +1643,16 @@
     </w:p>
     <w:p>
       <w:pPr>
-        <w:pStyle w:val="ListNumber"/>
-      </w:pPr>
+        <w:spacing w:after="80"/>
+        <w:ind w:left="547" w:hanging="274"/>
+      </w:pPr>
+      <w:r>
+        <w:rPr>
+          <w:rFonts w:ascii="Aptos" w:hAnsi="Aptos"/>
+          <w:color w:val="221D27"/>
+        </w:rPr>
+        <w:t xml:space="preserve">4. </w:t>
+      </w:r>
       <w:r>
         <w:rPr>
           <w:rFonts w:ascii="Aptos" w:hAnsi="Aptos"/>
@@ -1641,8 +1663,16 @@
     </w:p>
     <w:p>
       <w:pPr>
-        <w:pStyle w:val="ListNumber"/>
-      </w:pPr>
+        <w:spacing w:after="80"/>
+        <w:ind w:left="547" w:hanging="274"/>
+      </w:pPr>
+      <w:r>
+        <w:rPr>
+          <w:rFonts w:ascii="Aptos" w:hAnsi="Aptos"/>
+          <w:color w:val="221D27"/>
+        </w:rPr>
+        <w:t xml:space="preserve">5. </w:t>
+      </w:r>
       <w:r>
         <w:rPr>
           <w:rFonts w:ascii="Aptos" w:hAnsi="Aptos"/>
@@ -1735,11 +1765,6 @@
           <w:color w:val="221D27"/>
         </w:rPr>
         <w:t xml:space="preserve"> is a shell expansion, and “file equals inode” is an oversimplification across all filesystem types. The reader uses “filesystem object” where inode behavior is not guaranteed.</w:t>
-      </w:r>
-    </w:p>
-    <w:p>
-      <w:r>
-        <w:br w:type="page"/>
       </w:r>
     </w:p>
     <w:p>
@@ -2121,8 +2146,16 @@
     </w:p>
     <w:p>
       <w:pPr>
-        <w:pStyle w:val="ListNumber"/>
-      </w:pPr>
+        <w:spacing w:after="80"/>
+        <w:ind w:left="547" w:hanging="274"/>
+      </w:pPr>
+      <w:r>
+        <w:rPr>
+          <w:rFonts w:ascii="Aptos" w:hAnsi="Aptos"/>
+          <w:color w:val="221D27"/>
+        </w:rPr>
+        <w:t xml:space="preserve">1. </w:t>
+      </w:r>
       <w:r>
         <w:rPr>
           <w:rFonts w:ascii="Aptos" w:hAnsi="Aptos"/>
@@ -2133,8 +2166,16 @@
     </w:p>
     <w:p>
       <w:pPr>
-        <w:pStyle w:val="ListNumber"/>
-      </w:pPr>
+        <w:spacing w:after="80"/>
+        <w:ind w:left="547" w:hanging="274"/>
+      </w:pPr>
+      <w:r>
+        <w:rPr>
+          <w:rFonts w:ascii="Aptos" w:hAnsi="Aptos"/>
+          <w:color w:val="221D27"/>
+        </w:rPr>
+        <w:t xml:space="preserve">2. </w:t>
+      </w:r>
       <w:r>
         <w:rPr>
           <w:rFonts w:ascii="Aptos" w:hAnsi="Aptos"/>
@@ -2145,8 +2186,16 @@
     </w:p>
     <w:p>
       <w:pPr>
-        <w:pStyle w:val="ListNumber"/>
-      </w:pPr>
+        <w:spacing w:after="80"/>
+        <w:ind w:left="547" w:hanging="274"/>
+      </w:pPr>
+      <w:r>
+        <w:rPr>
+          <w:rFonts w:ascii="Aptos" w:hAnsi="Aptos"/>
+          <w:color w:val="221D27"/>
+        </w:rPr>
+        <w:t xml:space="preserve">3. </w:t>
+      </w:r>
       <w:r>
         <w:rPr>
           <w:rFonts w:ascii="Aptos" w:hAnsi="Aptos"/>
@@ -2157,8 +2206,16 @@
     </w:p>
     <w:p>
       <w:pPr>
-        <w:pStyle w:val="ListNumber"/>
-      </w:pPr>
+        <w:spacing w:after="80"/>
+        <w:ind w:left="547" w:hanging="274"/>
+      </w:pPr>
+      <w:r>
+        <w:rPr>
+          <w:rFonts w:ascii="Aptos" w:hAnsi="Aptos"/>
+          <w:color w:val="221D27"/>
+        </w:rPr>
+        <w:t xml:space="preserve">4. </w:t>
+      </w:r>
       <w:r>
         <w:rPr>
           <w:rFonts w:ascii="Aptos" w:hAnsi="Aptos"/>
@@ -2169,8 +2226,16 @@
     </w:p>
     <w:p>
       <w:pPr>
-        <w:pStyle w:val="ListNumber"/>
-      </w:pPr>
+        <w:spacing w:after="80"/>
+        <w:ind w:left="547" w:hanging="274"/>
+      </w:pPr>
+      <w:r>
+        <w:rPr>
+          <w:rFonts w:ascii="Aptos" w:hAnsi="Aptos"/>
+          <w:color w:val="221D27"/>
+        </w:rPr>
+        <w:t xml:space="preserve">5. </w:t>
+      </w:r>
       <w:r>
         <w:rPr>
           <w:rFonts w:ascii="Aptos" w:hAnsi="Aptos"/>
@@ -2325,11 +2390,6 @@
           <w:color w:val="221D27"/>
         </w:rPr>
         <w:t xml:space="preserve"> is an option, not the default.</w:t>
-      </w:r>
-    </w:p>
-    <w:p>
-      <w:r>
-        <w:br w:type="page"/>
       </w:r>
     </w:p>
     <w:p>
@@ -2687,11 +2747,6 @@
       </w:r>
     </w:p>
     <w:p>
-      <w:r>
-        <w:br w:type="page"/>
-      </w:r>
-    </w:p>
-    <w:p>
       <w:pPr>
         <w:pStyle w:val="Heading1"/>
       </w:pPr>
@@ -3272,11 +3327,6 @@
           <w:color w:val="221D27"/>
         </w:rPr>
         <w:t xml:space="preserve"> The core permission model is accurate. The reader adds the crucial “one matching class” rule, directory deletion semantics, NSS identity sources, and non-mode access controls.</w:t>
-      </w:r>
-    </w:p>
-    <w:p>
-      <w:r>
-        <w:br w:type="page"/>
       </w:r>
     </w:p>
     <w:p>
@@ -3769,11 +3819,6 @@
       </w:r>
     </w:p>
     <w:p>
-      <w:r>
-        <w:br w:type="page"/>
-      </w:r>
-    </w:p>
-    <w:p>
       <w:pPr>
         <w:pStyle w:val="Heading1"/>
       </w:pPr>
@@ -4253,8 +4298,16 @@
     </w:p>
     <w:p>
       <w:pPr>
-        <w:pStyle w:val="ListNumber"/>
-      </w:pPr>
+        <w:spacing w:after="80"/>
+        <w:ind w:left="547" w:hanging="274"/>
+      </w:pPr>
+      <w:r>
+        <w:rPr>
+          <w:rFonts w:ascii="Aptos" w:hAnsi="Aptos"/>
+          <w:color w:val="221D27"/>
+        </w:rPr>
+        <w:t xml:space="preserve">1. </w:t>
+      </w:r>
       <w:r>
         <w:rPr>
           <w:rFonts w:ascii="Aptos" w:hAnsi="Aptos"/>
@@ -4265,8 +4318,16 @@
     </w:p>
     <w:p>
       <w:pPr>
-        <w:pStyle w:val="ListNumber"/>
-      </w:pPr>
+        <w:spacing w:after="80"/>
+        <w:ind w:left="547" w:hanging="274"/>
+      </w:pPr>
+      <w:r>
+        <w:rPr>
+          <w:rFonts w:ascii="Aptos" w:hAnsi="Aptos"/>
+          <w:color w:val="221D27"/>
+        </w:rPr>
+        <w:t xml:space="preserve">2. </w:t>
+      </w:r>
       <w:r>
         <w:rPr>
           <w:rFonts w:ascii="Aptos" w:hAnsi="Aptos"/>
@@ -4277,8 +4338,16 @@
     </w:p>
     <w:p>
       <w:pPr>
-        <w:pStyle w:val="ListNumber"/>
-      </w:pPr>
+        <w:spacing w:after="80"/>
+        <w:ind w:left="547" w:hanging="274"/>
+      </w:pPr>
+      <w:r>
+        <w:rPr>
+          <w:rFonts w:ascii="Aptos" w:hAnsi="Aptos"/>
+          <w:color w:val="221D27"/>
+        </w:rPr>
+        <w:t xml:space="preserve">3. </w:t>
+      </w:r>
       <w:r>
         <w:rPr>
           <w:rFonts w:ascii="Aptos" w:hAnsi="Aptos"/>
@@ -4289,8 +4358,16 @@
     </w:p>
     <w:p>
       <w:pPr>
-        <w:pStyle w:val="ListNumber"/>
-      </w:pPr>
+        <w:spacing w:after="80"/>
+        <w:ind w:left="547" w:hanging="274"/>
+      </w:pPr>
+      <w:r>
+        <w:rPr>
+          <w:rFonts w:ascii="Aptos" w:hAnsi="Aptos"/>
+          <w:color w:val="221D27"/>
+        </w:rPr>
+        <w:t xml:space="preserve">4. </w:t>
+      </w:r>
       <w:r>
         <w:rPr>
           <w:rFonts w:ascii="Aptos" w:hAnsi="Aptos"/>
@@ -4301,8 +4378,16 @@
     </w:p>
     <w:p>
       <w:pPr>
-        <w:pStyle w:val="ListNumber"/>
-      </w:pPr>
+        <w:spacing w:after="80"/>
+        <w:ind w:left="547" w:hanging="274"/>
+      </w:pPr>
+      <w:r>
+        <w:rPr>
+          <w:rFonts w:ascii="Aptos" w:hAnsi="Aptos"/>
+          <w:color w:val="221D27"/>
+        </w:rPr>
+        <w:t xml:space="preserve">5. </w:t>
+      </w:r>
       <w:r>
         <w:rPr>
           <w:rFonts w:ascii="Aptos" w:hAnsi="Aptos"/>
@@ -4335,11 +4420,6 @@
           <w:color w:val="221D27"/>
         </w:rPr>
         <w:t xml:space="preserve"> The journalctl examples match systemd documentation. The reader explicitly makes retention and access conditional, correcting the common assumption that previous-boot logs always exist.</w:t>
-      </w:r>
-    </w:p>
-    <w:p>
-      <w:r>
-        <w:br w:type="page"/>
       </w:r>
     </w:p>
     <w:p>
@@ -4830,8 +4910,16 @@
     </w:p>
     <w:p>
       <w:pPr>
-        <w:pStyle w:val="ListNumber"/>
-      </w:pPr>
+        <w:spacing w:after="80"/>
+        <w:ind w:left="547" w:hanging="274"/>
+      </w:pPr>
+      <w:r>
+        <w:rPr>
+          <w:rFonts w:ascii="Aptos" w:hAnsi="Aptos"/>
+          <w:color w:val="221D27"/>
+        </w:rPr>
+        <w:t xml:space="preserve">1. </w:t>
+      </w:r>
       <w:r>
         <w:rPr>
           <w:rFonts w:ascii="Aptos" w:hAnsi="Aptos"/>
@@ -4895,8 +4983,16 @@
     </w:p>
     <w:p>
       <w:pPr>
-        <w:pStyle w:val="ListNumber"/>
-      </w:pPr>
+        <w:spacing w:after="80"/>
+        <w:ind w:left="547" w:hanging="274"/>
+      </w:pPr>
+      <w:r>
+        <w:rPr>
+          <w:rFonts w:ascii="Aptos" w:hAnsi="Aptos"/>
+          <w:color w:val="221D27"/>
+        </w:rPr>
+        <w:t xml:space="preserve">2. </w:t>
+      </w:r>
       <w:r>
         <w:rPr>
           <w:rFonts w:ascii="Aptos" w:hAnsi="Aptos"/>
@@ -4930,8 +5026,16 @@
     </w:p>
     <w:p>
       <w:pPr>
-        <w:pStyle w:val="ListNumber"/>
-      </w:pPr>
+        <w:spacing w:after="80"/>
+        <w:ind w:left="547" w:hanging="274"/>
+      </w:pPr>
+      <w:r>
+        <w:rPr>
+          <w:rFonts w:ascii="Aptos" w:hAnsi="Aptos"/>
+          <w:color w:val="221D27"/>
+        </w:rPr>
+        <w:t xml:space="preserve">3. </w:t>
+      </w:r>
       <w:r>
         <w:rPr>
           <w:rFonts w:ascii="Aptos" w:hAnsi="Aptos"/>
@@ -4980,8 +5084,16 @@
     </w:p>
     <w:p>
       <w:pPr>
-        <w:pStyle w:val="ListNumber"/>
-      </w:pPr>
+        <w:spacing w:after="80"/>
+        <w:ind w:left="547" w:hanging="274"/>
+      </w:pPr>
+      <w:r>
+        <w:rPr>
+          <w:rFonts w:ascii="Aptos" w:hAnsi="Aptos"/>
+          <w:color w:val="221D27"/>
+        </w:rPr>
+        <w:t xml:space="preserve">4. </w:t>
+      </w:r>
       <w:r>
         <w:rPr>
           <w:rFonts w:ascii="Aptos" w:hAnsi="Aptos"/>
@@ -5057,8 +5169,16 @@
     </w:p>
     <w:p>
       <w:pPr>
-        <w:pStyle w:val="ListNumber"/>
-      </w:pPr>
+        <w:spacing w:after="80"/>
+        <w:ind w:left="547" w:hanging="274"/>
+      </w:pPr>
+      <w:r>
+        <w:rPr>
+          <w:rFonts w:ascii="Aptos" w:hAnsi="Aptos"/>
+          <w:color w:val="221D27"/>
+        </w:rPr>
+        <w:t xml:space="preserve">1. </w:t>
+      </w:r>
       <w:r>
         <w:rPr>
           <w:rFonts w:ascii="Aptos" w:hAnsi="Aptos"/>
@@ -5069,8 +5189,16 @@
     </w:p>
     <w:p>
       <w:pPr>
-        <w:pStyle w:val="ListNumber"/>
-      </w:pPr>
+        <w:spacing w:after="80"/>
+        <w:ind w:left="547" w:hanging="274"/>
+      </w:pPr>
+      <w:r>
+        <w:rPr>
+          <w:rFonts w:ascii="Aptos" w:hAnsi="Aptos"/>
+          <w:color w:val="221D27"/>
+        </w:rPr>
+        <w:t xml:space="preserve">2. </w:t>
+      </w:r>
       <w:r>
         <w:rPr>
           <w:rFonts w:ascii="Aptos" w:hAnsi="Aptos"/>
@@ -5081,8 +5209,16 @@
     </w:p>
     <w:p>
       <w:pPr>
-        <w:pStyle w:val="ListNumber"/>
-      </w:pPr>
+        <w:spacing w:after="80"/>
+        <w:ind w:left="547" w:hanging="274"/>
+      </w:pPr>
+      <w:r>
+        <w:rPr>
+          <w:rFonts w:ascii="Aptos" w:hAnsi="Aptos"/>
+          <w:color w:val="221D27"/>
+        </w:rPr>
+        <w:t xml:space="preserve">3. </w:t>
+      </w:r>
       <w:r>
         <w:rPr>
           <w:rFonts w:ascii="Aptos" w:hAnsi="Aptos"/>
@@ -5093,8 +5229,16 @@
     </w:p>
     <w:p>
       <w:pPr>
-        <w:pStyle w:val="ListNumber"/>
-      </w:pPr>
+        <w:spacing w:after="80"/>
+        <w:ind w:left="547" w:hanging="274"/>
+      </w:pPr>
+      <w:r>
+        <w:rPr>
+          <w:rFonts w:ascii="Aptos" w:hAnsi="Aptos"/>
+          <w:color w:val="221D27"/>
+        </w:rPr>
+        <w:t xml:space="preserve">4. </w:t>
+      </w:r>
       <w:r>
         <w:rPr>
           <w:rFonts w:ascii="Aptos" w:hAnsi="Aptos"/>
@@ -5105,8 +5249,16 @@
     </w:p>
     <w:p>
       <w:pPr>
-        <w:pStyle w:val="ListNumber"/>
-      </w:pPr>
+        <w:spacing w:after="80"/>
+        <w:ind w:left="547" w:hanging="274"/>
+      </w:pPr>
+      <w:r>
+        <w:rPr>
+          <w:rFonts w:ascii="Aptos" w:hAnsi="Aptos"/>
+          <w:color w:val="221D27"/>
+        </w:rPr>
+        <w:t xml:space="preserve">5. </w:t>
+      </w:r>
       <w:r>
         <w:rPr>
           <w:rFonts w:ascii="Aptos" w:hAnsi="Aptos"/>
@@ -5117,8 +5269,16 @@
     </w:p>
     <w:p>
       <w:pPr>
-        <w:pStyle w:val="ListNumber"/>
-      </w:pPr>
+        <w:spacing w:after="80"/>
+        <w:ind w:left="547" w:hanging="274"/>
+      </w:pPr>
+      <w:r>
+        <w:rPr>
+          <w:rFonts w:ascii="Aptos" w:hAnsi="Aptos"/>
+          <w:color w:val="221D27"/>
+        </w:rPr>
+        <w:t xml:space="preserve">6. </w:t>
+      </w:r>
       <w:r>
         <w:rPr>
           <w:rFonts w:ascii="Aptos" w:hAnsi="Aptos"/>
@@ -5129,8 +5289,16 @@
     </w:p>
     <w:p>
       <w:pPr>
-        <w:pStyle w:val="ListNumber"/>
-      </w:pPr>
+        <w:spacing w:after="80"/>
+        <w:ind w:left="547" w:hanging="274"/>
+      </w:pPr>
+      <w:r>
+        <w:rPr>
+          <w:rFonts w:ascii="Aptos" w:hAnsi="Aptos"/>
+          <w:color w:val="221D27"/>
+        </w:rPr>
+        <w:t xml:space="preserve">7. </w:t>
+      </w:r>
       <w:r>
         <w:rPr>
           <w:rFonts w:ascii="Aptos" w:hAnsi="Aptos"/>
@@ -5141,8 +5309,16 @@
     </w:p>
     <w:p>
       <w:pPr>
-        <w:pStyle w:val="ListNumber"/>
-      </w:pPr>
+        <w:spacing w:after="80"/>
+        <w:ind w:left="547" w:hanging="274"/>
+      </w:pPr>
+      <w:r>
+        <w:rPr>
+          <w:rFonts w:ascii="Aptos" w:hAnsi="Aptos"/>
+          <w:color w:val="221D27"/>
+        </w:rPr>
+        <w:t xml:space="preserve">8. </w:t>
+      </w:r>
       <w:r>
         <w:rPr>
           <w:rFonts w:ascii="Aptos" w:hAnsi="Aptos"/>
@@ -5218,66 +5394,33 @@
         <w:pStyle w:val="Heading1"/>
       </w:pPr>
       <w:r>
-        <w:t>9. Fact-check summary and corrections to retain</w:t>
+        <w:t>9. Processes, service ownership, sockets, and client evidence</w:t>
       </w:r>
     </w:p>
     <w:p>
-      <w:r>
-        <w:rPr>
-          <w:rFonts w:ascii="Aptos" w:hAnsi="Aptos"/>
-          <w:color w:val="221D27"/>
-        </w:rPr>
-        <w:t>The underlying course theory is technically strong. The review did not find a need to change the course’s operational model, but these qualifications are important:</w:t>
+      <w:pPr>
+        <w:pStyle w:val="Heading2"/>
+      </w:pPr>
+      <w:r>
+        <w:t>9.1 A process is a running program with context</w:t>
       </w:r>
     </w:p>
     <w:p>
-      <w:pPr>
-        <w:pStyle w:val="ListBullet"/>
-      </w:pPr>
-      <w:r>
-        <w:rPr>
-          <w:rFonts w:ascii="Aptos" w:hAnsi="Aptos"/>
-          <w:color w:val="221D27"/>
-        </w:rPr>
-        <w:t xml:space="preserve"> </w:t>
-      </w:r>
-      <w:r>
-        <w:rPr>
-          <w:rFonts w:ascii="Aptos" w:hAnsi="Aptos"/>
-          <w:color w:val="221D27"/>
-        </w:rPr>
-        <w:t>“Linux” is not one distribution; package, service, and policy details must be labeled.</w:t>
+      <w:r>
+        <w:rPr>
+          <w:rFonts w:ascii="Aptos" w:hAnsi="Aptos"/>
+          <w:color w:val="221D27"/>
+        </w:rPr>
+        <w:t>A process is not merely a command name. It has a PID, a parent, user and group credentials, a current directory, an environment, memory mappings, and open file descriptors. Those descriptors may name files, pipes, devices, or sockets. A PID is temporary and can be reused after a process exits, so a trustworthy investigation binds the PID to a unit, start time, command, and identity instead of recording the number alone.</w:t>
       </w:r>
     </w:p>
     <w:p>
-      <w:pPr>
-        <w:pStyle w:val="ListBullet"/>
-      </w:pPr>
-      <w:r>
-        <w:rPr>
-          <w:rFonts w:ascii="Aptos" w:hAnsi="Aptos"/>
-          <w:color w:val="221D27"/>
-        </w:rPr>
-        <w:t xml:space="preserve"> </w:t>
-      </w:r>
-      <w:r>
-        <w:rPr>
-          <w:rFonts w:ascii="Aptos" w:hAnsi="Aptos"/>
-          <w:color w:val="221D27"/>
-        </w:rPr>
-        <w:t>VM isolation is not unconditionally stronger; configuration and threat model matter.</w:t>
-      </w:r>
-    </w:p>
-    <w:p>
-      <w:pPr>
-        <w:pStyle w:val="ListBullet"/>
-      </w:pPr>
-      <w:r>
-        <w:rPr>
-          <w:rFonts w:ascii="Aptos" w:hAnsi="Aptos"/>
-          <w:color w:val="221D27"/>
-        </w:rPr>
-        <w:t xml:space="preserve"> </w:t>
+      <w:r>
+        <w:rPr>
+          <w:rFonts w:ascii="Aptos" w:hAnsi="Aptos"/>
+          <w:color w:val="221D27"/>
+        </w:rPr>
+        <w:t xml:space="preserve">For a systemd service, the manager’s </w:t>
       </w:r>
       <w:r>
         <w:rPr>
@@ -5285,60 +5428,50 @@
           <w:color w:val="471D4F"/>
           <w:sz w:val="18"/>
         </w:rPr>
-        <w:t>~</w:t>
-      </w:r>
-      <w:r>
-        <w:rPr>
-          <w:rFonts w:ascii="Aptos" w:hAnsi="Aptos"/>
-          <w:color w:val="221D27"/>
-        </w:rPr>
-        <w:t xml:space="preserve"> is expanded by the shell, not resolved as a literal filesystem component.</w:t>
+        <w:t>MainPID</w:t>
+      </w:r>
+      <w:r>
+        <w:rPr>
+          <w:rFonts w:ascii="Aptos" w:hAnsi="Aptos"/>
+          <w:color w:val="221D27"/>
+        </w:rPr>
+        <w:t xml:space="preserve"> is the starting point, not the entire proof:</w:t>
       </w:r>
     </w:p>
     <w:p>
       <w:pPr>
-        <w:pStyle w:val="ListBullet"/>
-      </w:pPr>
-      <w:r>
-        <w:rPr>
-          <w:rFonts w:ascii="Aptos" w:hAnsi="Aptos"/>
-          <w:color w:val="221D27"/>
-        </w:rPr>
-        <w:t xml:space="preserve"> </w:t>
-      </w:r>
-      <w:r>
-        <w:rPr>
-          <w:rFonts w:ascii="Aptos" w:hAnsi="Aptos"/>
-          <w:color w:val="221D27"/>
-        </w:rPr>
-        <w:t xml:space="preserve">Bash pipeline status comes from the final command unless </w:t>
-      </w:r>
+        <w:pStyle w:val="CourseCode"/>
+        <w:keepLines/>
+        <w:shd w:fill="35213B"/>
+      </w:pPr>
+      <w:r>
+        <w:rPr>
+          <w:rFonts w:ascii="Menlo" w:hAnsi="Menlo"/>
+          <w:color w:val="F5F0F7"/>
+          <w:sz w:val="16"/>
+        </w:rPr>
+        <w:t>systemctl show demo.service -p MainPID -p ExecStart -p ActiveState</w:t>
+        <w:br/>
+        <w:t>pid="$(systemctl show demo.service -p MainPID --value)"</w:t>
+        <w:br/>
+        <w:t>ps -o pid,ppid,user,group,lstart,stat,cmd -p "$pid"</w:t>
+      </w:r>
+    </w:p>
+    <w:p>
       <w:r>
         <w:rPr>
           <w:rFonts w:ascii="Menlo" w:hAnsi="Menlo"/>
           <w:color w:val="471D4F"/>
           <w:sz w:val="18"/>
         </w:rPr>
-        <w:t>pipefail</w:t>
-      </w:r>
-      <w:r>
-        <w:rPr>
-          <w:rFonts w:ascii="Aptos" w:hAnsi="Aptos"/>
-          <w:color w:val="221D27"/>
-        </w:rPr>
-        <w:t xml:space="preserve"> is enabled.</w:t>
-      </w:r>
-    </w:p>
-    <w:p>
-      <w:pPr>
-        <w:pStyle w:val="ListBullet"/>
-      </w:pPr>
-      <w:r>
-        <w:rPr>
-          <w:rFonts w:ascii="Aptos" w:hAnsi="Aptos"/>
-          <w:color w:val="221D27"/>
-        </w:rPr>
-        <w:t xml:space="preserve"> </w:t>
+        <w:t>systemctl show</w:t>
+      </w:r>
+      <w:r>
+        <w:rPr>
+          <w:rFonts w:ascii="Aptos" w:hAnsi="Aptos"/>
+          <w:color w:val="221D27"/>
+        </w:rPr>
+        <w:t xml:space="preserve"> reports the manager’s properties. </w:t>
       </w:r>
       <w:r>
         <w:rPr>
@@ -5346,91 +5479,39 @@
           <w:color w:val="471D4F"/>
           <w:sz w:val="18"/>
         </w:rPr>
-        <w:t>/etc/passwd</w:t>
-      </w:r>
-      <w:r>
-        <w:rPr>
-          <w:rFonts w:ascii="Aptos" w:hAnsi="Aptos"/>
-          <w:color w:val="221D27"/>
-        </w:rPr>
-        <w:t xml:space="preserve"> is not necessarily the complete identity source; use NSS-aware tools.</w:t>
+        <w:t>ps</w:t>
+      </w:r>
+      <w:r>
+        <w:rPr>
+          <w:rFonts w:ascii="Aptos" w:hAnsi="Aptos"/>
+          <w:color w:val="221D27"/>
+        </w:rPr>
+        <w:t xml:space="preserve"> reports a process-table view. Their agreement supports the claim that the manager is tracking the process you inspected; neither proves that the service is listening or useful to a client.</w:t>
       </w:r>
     </w:p>
     <w:p>
       <w:pPr>
-        <w:pStyle w:val="ListBullet"/>
-      </w:pPr>
-      <w:r>
-        <w:rPr>
-          <w:rFonts w:ascii="Aptos" w:hAnsi="Aptos"/>
-          <w:color w:val="221D27"/>
-        </w:rPr>
-        <w:t xml:space="preserve"> </w:t>
-      </w:r>
-      <w:r>
-        <w:rPr>
-          <w:rFonts w:ascii="Aptos" w:hAnsi="Aptos"/>
-          <w:color w:val="221D27"/>
-        </w:rPr>
-        <w:t>Deleting a file depends chiefly on parent-directory permissions, plus other controls.</w:t>
+        <w:pStyle w:val="Heading2"/>
+      </w:pPr>
+      <w:r>
+        <w:t>9.2 Procfs is supporting evidence, not a stable command API</w:t>
       </w:r>
     </w:p>
     <w:p>
-      <w:pPr>
-        <w:pStyle w:val="ListBullet"/>
-      </w:pPr>
-      <w:r>
-        <w:rPr>
-          <w:rFonts w:ascii="Aptos" w:hAnsi="Aptos"/>
-          <w:color w:val="221D27"/>
-        </w:rPr>
-        <w:t xml:space="preserve"> </w:t>
-      </w:r>
       <w:r>
         <w:rPr>
           <w:rFonts w:ascii="Menlo" w:hAnsi="Menlo"/>
           <w:color w:val="471D4F"/>
           <w:sz w:val="18"/>
         </w:rPr>
-        <w:t>apt purge</w:t>
-      </w:r>
-      <w:r>
-        <w:rPr>
-          <w:rFonts w:ascii="Aptos" w:hAnsi="Aptos"/>
-          <w:color w:val="221D27"/>
-        </w:rPr>
-        <w:t xml:space="preserve"> does not guarantee erasure of all application or user-created data.</w:t>
-      </w:r>
-    </w:p>
-    <w:p>
-      <w:pPr>
-        <w:pStyle w:val="ListBullet"/>
-      </w:pPr>
-      <w:r>
-        <w:rPr>
-          <w:rFonts w:ascii="Aptos" w:hAnsi="Aptos"/>
-          <w:color w:val="221D27"/>
-        </w:rPr>
-        <w:t xml:space="preserve"> </w:t>
-      </w:r>
-      <w:r>
-        <w:rPr>
-          <w:rFonts w:ascii="Aptos" w:hAnsi="Aptos"/>
-          <w:color w:val="221D27"/>
-        </w:rPr>
-        <w:t>First-contact SSH key acceptance does not independently verify server identity.</w:t>
-      </w:r>
-    </w:p>
-    <w:p>
-      <w:pPr>
-        <w:pStyle w:val="ListBullet"/>
-      </w:pPr>
-      <w:r>
-        <w:rPr>
-          <w:rFonts w:ascii="Aptos" w:hAnsi="Aptos"/>
-          <w:color w:val="221D27"/>
-        </w:rPr>
-        <w:t xml:space="preserve"> </w:t>
+        <w:t>/proc/PID/</w:t>
+      </w:r>
+      <w:r>
+        <w:rPr>
+          <w:rFonts w:ascii="Aptos" w:hAnsi="Aptos"/>
+          <w:color w:val="221D27"/>
+        </w:rPr>
+        <w:t xml:space="preserve"> exposes process information through a virtual filesystem. </w:t>
       </w:r>
       <w:r>
         <w:rPr>
@@ -5438,64 +5519,42 @@
           <w:color w:val="471D4F"/>
           <w:sz w:val="18"/>
         </w:rPr>
-        <w:t>ssh-keyscan</w:t>
-      </w:r>
-      <w:r>
-        <w:rPr>
-          <w:rFonts w:ascii="Aptos" w:hAnsi="Aptos"/>
-          <w:color w:val="221D27"/>
-        </w:rPr>
-        <w:t xml:space="preserve"> collects a key but does not authenticate it.</w:t>
+        <w:t>/proc/PID/cmdline</w:t>
+      </w:r>
+      <w:r>
+        <w:rPr>
+          <w:rFonts w:ascii="Aptos" w:hAnsi="Aptos"/>
+          <w:color w:val="221D27"/>
+        </w:rPr>
+        <w:t xml:space="preserve"> contains the command-line arguments separated by NUL bytes, and it can be empty for some processes. A process can also alter what is visible there, so the file supports an account; it should not be treated as an unforgeable identity record [21]. Render it deliberately:</w:t>
       </w:r>
     </w:p>
     <w:p>
       <w:pPr>
-        <w:pStyle w:val="ListBullet"/>
-      </w:pPr>
-      <w:r>
-        <w:rPr>
-          <w:rFonts w:ascii="Aptos" w:hAnsi="Aptos"/>
-          <w:color w:val="221D27"/>
-        </w:rPr>
-        <w:t xml:space="preserve"> </w:t>
-      </w:r>
-      <w:r>
-        <w:rPr>
-          <w:rFonts w:ascii="Aptos" w:hAnsi="Aptos"/>
-          <w:color w:val="221D27"/>
-        </w:rPr>
-        <w:t>Previous-boot journal data exists only if it was retained.</w:t>
+        <w:pStyle w:val="CourseCode"/>
+        <w:keepLines/>
+        <w:shd w:fill="35213B"/>
+      </w:pPr>
+      <w:r>
+        <w:rPr>
+          <w:rFonts w:ascii="Menlo" w:hAnsi="Menlo"/>
+          <w:color w:val="F5F0F7"/>
+          <w:sz w:val="16"/>
+        </w:rPr>
+        <w:t>sudo tr '\0' ' ' &lt;"/proc/$pid/cmdline"; echo</w:t>
+        <w:br/>
+        <w:t>sudo readlink -f "/proc/$pid/exe"</w:t>
+        <w:br/>
+        <w:t>sudo ls -l "/proc/$pid/fd"</w:t>
       </w:r>
     </w:p>
     <w:p>
-      <w:pPr>
-        <w:pStyle w:val="ListBullet"/>
-      </w:pPr>
-      <w:r>
-        <w:rPr>
-          <w:rFonts w:ascii="Aptos" w:hAnsi="Aptos"/>
-          <w:color w:val="221D27"/>
-        </w:rPr>
-        <w:t xml:space="preserve"> </w:t>
-      </w:r>
-      <w:r>
-        <w:rPr>
-          <w:rFonts w:ascii="Aptos" w:hAnsi="Aptos"/>
-          <w:color w:val="221D27"/>
-        </w:rPr>
-        <w:t>systemd vendor-unit paths vary; inspect the effective unit instead of assuming a path.</w:t>
-      </w:r>
-    </w:p>
-    <w:p>
-      <w:pPr>
-        <w:pStyle w:val="ListBullet"/>
-      </w:pPr>
-      <w:r>
-        <w:rPr>
-          <w:rFonts w:ascii="Aptos" w:hAnsi="Aptos"/>
-          <w:color w:val="221D27"/>
-        </w:rPr>
-        <w:t xml:space="preserve"> </w:t>
+      <w:r>
+        <w:rPr>
+          <w:rFonts w:ascii="Aptos" w:hAnsi="Aptos"/>
+          <w:color w:val="221D27"/>
+        </w:rPr>
+        <w:t xml:space="preserve">Permissions, namespaces, kernel hardening, or an exited process may limit these views. Capture the process evidence before restarting or stopping the unit because the PID and </w:t>
       </w:r>
       <w:r>
         <w:rPr>
@@ -5503,37 +5562,1042 @@
           <w:color w:val="471D4F"/>
           <w:sz w:val="18"/>
         </w:rPr>
-        <w:t>enabled</w:t>
-      </w:r>
-      <w:r>
-        <w:rPr>
-          <w:rFonts w:ascii="Aptos" w:hAnsi="Aptos"/>
-          <w:color w:val="221D27"/>
-        </w:rPr>
-        <w:t xml:space="preserve">, </w:t>
-      </w:r>
+        <w:t>/proc</w:t>
+      </w:r>
+      <w:r>
+        <w:rPr>
+          <w:rFonts w:ascii="Aptos" w:hAnsi="Aptos"/>
+          <w:color w:val="221D27"/>
+        </w:rPr>
+        <w:t xml:space="preserve"> directory will change.</w:t>
+      </w:r>
+    </w:p>
+    <w:p>
+      <w:pPr>
+        <w:pStyle w:val="Heading2"/>
+      </w:pPr>
+      <w:r>
+        <w:t>9.3 A listening socket and a successful request prove different layers</w:t>
+      </w:r>
+    </w:p>
+    <w:p>
       <w:r>
         <w:rPr>
           <w:rFonts w:ascii="Menlo" w:hAnsi="Menlo"/>
           <w:color w:val="471D4F"/>
           <w:sz w:val="18"/>
         </w:rPr>
-        <w:t>active</w:t>
-      </w:r>
-      <w:r>
-        <w:rPr>
-          <w:rFonts w:ascii="Aptos" w:hAnsi="Aptos"/>
-          <w:color w:val="221D27"/>
-        </w:rPr>
-        <w:t>, and behaviorally healthy are independent facts.</w:t>
+        <w:t>ss</w:t>
+      </w:r>
+      <w:r>
+        <w:rPr>
+          <w:rFonts w:ascii="Aptos" w:hAnsi="Aptos"/>
+          <w:color w:val="221D27"/>
+        </w:rPr>
+        <w:t xml:space="preserve"> displays socket information. </w:t>
+      </w:r>
+      <w:r>
+        <w:rPr>
+          <w:rFonts w:ascii="Menlo" w:hAnsi="Menlo"/>
+          <w:color w:val="471D4F"/>
+          <w:sz w:val="18"/>
+        </w:rPr>
+        <w:t>-l</w:t>
+      </w:r>
+      <w:r>
+        <w:rPr>
+          <w:rFonts w:ascii="Aptos" w:hAnsi="Aptos"/>
+          <w:color w:val="221D27"/>
+        </w:rPr>
+        <w:t xml:space="preserve"> selects listening sockets, </w:t>
+      </w:r>
+      <w:r>
+        <w:rPr>
+          <w:rFonts w:ascii="Menlo" w:hAnsi="Menlo"/>
+          <w:color w:val="471D4F"/>
+          <w:sz w:val="18"/>
+        </w:rPr>
+        <w:t>-t</w:t>
+      </w:r>
+      <w:r>
+        <w:rPr>
+          <w:rFonts w:ascii="Aptos" w:hAnsi="Aptos"/>
+          <w:color w:val="221D27"/>
+        </w:rPr>
+        <w:t xml:space="preserve"> TCP, </w:t>
+      </w:r>
+      <w:r>
+        <w:rPr>
+          <w:rFonts w:ascii="Menlo" w:hAnsi="Menlo"/>
+          <w:color w:val="471D4F"/>
+          <w:sz w:val="18"/>
+        </w:rPr>
+        <w:t>-n</w:t>
+      </w:r>
+      <w:r>
+        <w:rPr>
+          <w:rFonts w:ascii="Aptos" w:hAnsi="Aptos"/>
+          <w:color w:val="221D27"/>
+        </w:rPr>
+        <w:t xml:space="preserve"> numeric output, and </w:t>
+      </w:r>
+      <w:r>
+        <w:rPr>
+          <w:rFonts w:ascii="Menlo" w:hAnsi="Menlo"/>
+          <w:color w:val="471D4F"/>
+          <w:sz w:val="18"/>
+        </w:rPr>
+        <w:t>-p</w:t>
+      </w:r>
+      <w:r>
+        <w:rPr>
+          <w:rFonts w:ascii="Aptos" w:hAnsi="Aptos"/>
+          <w:color w:val="221D27"/>
+        </w:rPr>
+        <w:t xml:space="preserve"> process information when the caller is permitted to see it [22]. A listener proves that a transport endpoint exists; it does not prove that the intended protocol or application response works.</w:t>
       </w:r>
     </w:p>
     <w:p>
       <w:pPr>
+        <w:pStyle w:val="CourseCode"/>
+        <w:keepLines/>
+        <w:shd w:fill="35213B"/>
+      </w:pPr>
+      <w:r>
+        <w:rPr>
+          <w:rFonts w:ascii="Menlo" w:hAnsi="Menlo"/>
+          <w:color w:val="F5F0F7"/>
+          <w:sz w:val="16"/>
+        </w:rPr>
+        <w:t>sudo ss -ltnp 'sport = :9099'</w:t>
+        <w:br/>
+        <w:t>curl --fail --show-error http://127.0.0.1:9099/</w:t>
+      </w:r>
+    </w:p>
+    <w:p>
+      <w:r>
+        <w:rPr>
+          <w:rFonts w:ascii="Aptos" w:hAnsi="Aptos"/>
+          <w:color w:val="221D27"/>
+        </w:rPr>
+        <w:t xml:space="preserve">The client test should match the service contract: HTTP status and body for a web service, a protocol handshake for a database, or an authenticated operation where authorization matters. </w:t>
+      </w:r>
+      <w:r>
+        <w:rPr>
+          <w:rFonts w:ascii="Menlo" w:hAnsi="Menlo"/>
+          <w:color w:val="471D4F"/>
+          <w:sz w:val="18"/>
+        </w:rPr>
+        <w:t>curl</w:t>
+      </w:r>
+      <w:r>
+        <w:rPr>
+          <w:rFonts w:ascii="Aptos" w:hAnsi="Aptos"/>
+          <w:color w:val="221D27"/>
+        </w:rPr>
+        <w:t xml:space="preserve"> can prove an HTTP exchange at one address and time; it does not by itself prove remote reachability, firewall policy, DNS, TLS identity, or every application path.</w:t>
+      </w:r>
+    </w:p>
+    <w:p>
+      <w:pPr>
+        <w:pStyle w:val="Heading2"/>
+      </w:pPr>
+      <w:r>
+        <w:t>9.4 Stop managed processes through their manager</w:t>
+      </w:r>
+    </w:p>
+    <w:p>
+      <w:r>
+        <w:rPr>
+          <w:rFonts w:ascii="Aptos" w:hAnsi="Aptos"/>
+          <w:color w:val="221D27"/>
+        </w:rPr>
+        <w:t>Sending a signal directly to a service PID can bypass restart policy, cleanup, dependency handling, and the audit trail expected by the service manager. When systemd owns the process, request the lifecycle change through systemd and verify both manager and socket state:</w:t>
+      </w:r>
+    </w:p>
+    <w:p>
+      <w:pPr>
+        <w:pStyle w:val="CourseCode"/>
+        <w:keepLines/>
+        <w:shd w:fill="35213B"/>
+      </w:pPr>
+      <w:r>
+        <w:rPr>
+          <w:rFonts w:ascii="Menlo" w:hAnsi="Menlo"/>
+          <w:color w:val="F5F0F7"/>
+          <w:sz w:val="16"/>
+        </w:rPr>
+        <w:t>sudo systemctl stop demo.service</w:t>
+        <w:br/>
+        <w:t>systemctl is-active demo.service</w:t>
+        <w:br/>
+        <w:t>ss -ltnH 'sport = :9099'</w:t>
+      </w:r>
+    </w:p>
+    <w:p>
+      <w:r>
+        <w:rPr>
+          <w:rFonts w:ascii="Aptos" w:hAnsi="Aptos"/>
+          <w:color w:val="221D27"/>
+        </w:rPr>
+        <w:t xml:space="preserve">An expected non-zero result from </w:t>
+      </w:r>
+      <w:r>
+        <w:rPr>
+          <w:rFonts w:ascii="Menlo" w:hAnsi="Menlo"/>
+          <w:color w:val="471D4F"/>
+          <w:sz w:val="18"/>
+        </w:rPr>
+        <w:t>is-active</w:t>
+      </w:r>
+      <w:r>
+        <w:rPr>
+          <w:rFonts w:ascii="Aptos" w:hAnsi="Aptos"/>
+          <w:color w:val="221D27"/>
+        </w:rPr>
+        <w:t xml:space="preserve"> or an empty </w:t>
+      </w:r>
+      <w:r>
+        <w:rPr>
+          <w:rFonts w:ascii="Menlo" w:hAnsi="Menlo"/>
+          <w:color w:val="471D4F"/>
+          <w:sz w:val="18"/>
+        </w:rPr>
+        <w:t>ss</w:t>
+      </w:r>
+      <w:r>
+        <w:rPr>
+          <w:rFonts w:ascii="Aptos" w:hAnsi="Aptos"/>
+          <w:color w:val="221D27"/>
+        </w:rPr>
+        <w:t xml:space="preserve"> result must be interpreted as part of the stated postcondition, not automatically as an unexpected test failure.</w:t>
+      </w:r>
+    </w:p>
+    <w:p>
+      <w:r>
+        <w:rPr>
+          <w:rFonts w:ascii="Aptos" w:hAnsi="Aptos"/>
+          <w:b/>
+          <w:color w:val="221D27"/>
+        </w:rPr>
+        <w:t>Fact-check result.</w:t>
+      </w:r>
+      <w:r>
+        <w:rPr>
+          <w:rFonts w:ascii="Aptos" w:hAnsi="Aptos"/>
+          <w:color w:val="221D27"/>
+        </w:rPr>
+        <w:t xml:space="preserve"> The process-to-port investigation uses independent evidence planes: unit, exact PID, process credentials and command, listening socket, and client behavior. No single plane substitutes for the others.</w:t>
+      </w:r>
+    </w:p>
+    <w:p>
+      <w:pPr>
         <w:pStyle w:val="Heading1"/>
       </w:pPr>
       <w:r>
-        <w:t>10. Command quick reference</w:t>
+        <w:t>10. Durable systemd changes with drop-ins</w:t>
+      </w:r>
+    </w:p>
+    <w:p>
+      <w:pPr>
+        <w:pStyle w:val="Heading2"/>
+      </w:pPr>
+      <w:r>
+        <w:t>10.1 Effective configuration is assembled from layers</w:t>
+      </w:r>
+    </w:p>
+    <w:p>
+      <w:r>
+        <w:rPr>
+          <w:rFonts w:ascii="Aptos" w:hAnsi="Aptos"/>
+          <w:color w:val="221D27"/>
+        </w:rPr>
+        <w:t xml:space="preserve">systemd loads a main unit fragment and may merge drop-in files from precedence-ordered locations. Administrator-managed persistent changes belong under </w:t>
+      </w:r>
+      <w:r>
+        <w:rPr>
+          <w:rFonts w:ascii="Menlo" w:hAnsi="Menlo"/>
+          <w:color w:val="471D4F"/>
+          <w:sz w:val="18"/>
+        </w:rPr>
+        <w:t>/etc/systemd/system</w:t>
+      </w:r>
+      <w:r>
+        <w:rPr>
+          <w:rFonts w:ascii="Aptos" w:hAnsi="Aptos"/>
+          <w:color w:val="221D27"/>
+        </w:rPr>
+        <w:t xml:space="preserve">; runtime changes under </w:t>
+      </w:r>
+      <w:r>
+        <w:rPr>
+          <w:rFonts w:ascii="Menlo" w:hAnsi="Menlo"/>
+          <w:color w:val="471D4F"/>
+          <w:sz w:val="18"/>
+        </w:rPr>
+        <w:t>/run/systemd/system</w:t>
+      </w:r>
+      <w:r>
+        <w:rPr>
+          <w:rFonts w:ascii="Aptos" w:hAnsi="Aptos"/>
+          <w:color w:val="221D27"/>
+        </w:rPr>
+        <w:t xml:space="preserve"> disappear at reboot. The effective location and applied drop-ins should be queried rather than guessed [19]:</w:t>
+      </w:r>
+    </w:p>
+    <w:p>
+      <w:pPr>
+        <w:pStyle w:val="CourseCode"/>
+        <w:keepLines/>
+        <w:shd w:fill="35213B"/>
+      </w:pPr>
+      <w:r>
+        <w:rPr>
+          <w:rFonts w:ascii="Menlo" w:hAnsi="Menlo"/>
+          <w:color w:val="F5F0F7"/>
+          <w:sz w:val="16"/>
+        </w:rPr>
+        <w:t>systemctl show demo.service -p FragmentPath -p DropInPaths</w:t>
+        <w:br/>
+        <w:t>systemctl cat demo.service</w:t>
+      </w:r>
+    </w:p>
+    <w:p>
+      <w:r>
+        <w:rPr>
+          <w:rFonts w:ascii="Aptos" w:hAnsi="Aptos"/>
+          <w:color w:val="221D27"/>
+        </w:rPr>
+        <w:t>Editing a vendor fragment directly hides local intent inside package-owned content and risks replacement during upgrades. A narrowly scoped drop-in makes the administrator’s delta explicit.</w:t>
+      </w:r>
+    </w:p>
+    <w:p>
+      <w:pPr>
+        <w:pStyle w:val="Heading2"/>
+      </w:pPr>
+      <w:r>
+        <w:t>10.2 Drop-ins merge settings according to unit semantics</w:t>
+      </w:r>
+    </w:p>
+    <w:p>
+      <w:r>
+        <w:rPr>
+          <w:rFonts w:ascii="Aptos" w:hAnsi="Aptos"/>
+          <w:color w:val="221D27"/>
+        </w:rPr>
+        <w:t xml:space="preserve">A directory named </w:t>
+      </w:r>
+      <w:r>
+        <w:rPr>
+          <w:rFonts w:ascii="Menlo" w:hAnsi="Menlo"/>
+          <w:color w:val="471D4F"/>
+          <w:sz w:val="18"/>
+        </w:rPr>
+        <w:t>demo.service.d</w:t>
+      </w:r>
+      <w:r>
+        <w:rPr>
+          <w:rFonts w:ascii="Aptos" w:hAnsi="Aptos"/>
+          <w:color w:val="221D27"/>
+        </w:rPr>
+        <w:t xml:space="preserve"> can contain </w:t>
+      </w:r>
+      <w:r>
+        <w:rPr>
+          <w:rFonts w:ascii="Menlo" w:hAnsi="Menlo"/>
+          <w:color w:val="471D4F"/>
+          <w:sz w:val="18"/>
+        </w:rPr>
+        <w:t>*.conf</w:t>
+      </w:r>
+      <w:r>
+        <w:rPr>
+          <w:rFonts w:ascii="Aptos" w:hAnsi="Aptos"/>
+          <w:color w:val="221D27"/>
+        </w:rPr>
+        <w:t xml:space="preserve"> drop-ins. Settings are not all merged in the same way: many scalar settings replace an earlier value, while list-like settings may append and sometimes require an explicit empty assignment before replacement. The relevant unit and execution manuals define the behavior for each directive [19][23].</w:t>
+      </w:r>
+    </w:p>
+    <w:p>
+      <w:r>
+        <w:rPr>
+          <w:rFonts w:ascii="Aptos" w:hAnsi="Aptos"/>
+          <w:color w:val="221D27"/>
+        </w:rPr>
+        <w:t>For a simple environment override:</w:t>
+      </w:r>
+    </w:p>
+    <w:p>
+      <w:pPr>
+        <w:pStyle w:val="CourseCode"/>
+        <w:keepLines/>
+        <w:shd w:fill="35213B"/>
+      </w:pPr>
+      <w:r>
+        <w:rPr>
+          <w:rFonts w:ascii="Menlo" w:hAnsi="Menlo"/>
+          <w:color w:val="F5F0F7"/>
+          <w:sz w:val="16"/>
+        </w:rPr>
+        <w:t>[Service]</w:t>
+        <w:br/>
+        <w:t>Environment=COURSE_MODE=production</w:t>
+      </w:r>
+    </w:p>
+    <w:p>
+      <w:r>
+        <w:rPr>
+          <w:rFonts w:ascii="Aptos" w:hAnsi="Aptos"/>
+          <w:color w:val="221D27"/>
+        </w:rPr>
+        <w:t xml:space="preserve">Create administrator overrides with </w:t>
+      </w:r>
+      <w:r>
+        <w:rPr>
+          <w:rFonts w:ascii="Menlo" w:hAnsi="Menlo"/>
+          <w:color w:val="471D4F"/>
+          <w:sz w:val="18"/>
+        </w:rPr>
+        <w:t>systemctl edit demo.service</w:t>
+      </w:r>
+      <w:r>
+        <w:rPr>
+          <w:rFonts w:ascii="Aptos" w:hAnsi="Aptos"/>
+          <w:color w:val="221D27"/>
+        </w:rPr>
+        <w:t xml:space="preserve"> when practical. If automation writes the file directly, create the exact directory and file with controlled ownership and mode, then inspect the resulting content.</w:t>
+      </w:r>
+    </w:p>
+    <w:p>
+      <w:pPr>
+        <w:pStyle w:val="Heading2"/>
+      </w:pPr>
+      <w:r>
+        <w:t>10.3 Reloading definitions does not change the running process</w:t>
+      </w:r>
+    </w:p>
+    <w:p>
+      <w:r>
+        <w:rPr>
+          <w:rFonts w:ascii="Aptos" w:hAnsi="Aptos"/>
+          <w:color w:val="221D27"/>
+        </w:rPr>
+        <w:t>Three operations answer separate questions:</w:t>
+      </w:r>
+    </w:p>
+    <w:p>
+      <w:pPr>
+        <w:spacing w:after="80"/>
+        <w:ind w:left="547" w:hanging="274"/>
+      </w:pPr>
+      <w:r>
+        <w:rPr>
+          <w:rFonts w:ascii="Aptos" w:hAnsi="Aptos"/>
+          <w:color w:val="221D27"/>
+        </w:rPr>
+        <w:t xml:space="preserve">1. </w:t>
+      </w:r>
+      <w:r>
+        <w:rPr>
+          <w:rFonts w:ascii="Menlo" w:hAnsi="Menlo"/>
+          <w:color w:val="471D4F"/>
+          <w:sz w:val="18"/>
+        </w:rPr>
+        <w:t>systemctl daemon-reload</w:t>
+      </w:r>
+      <w:r>
+        <w:rPr>
+          <w:rFonts w:ascii="Aptos" w:hAnsi="Aptos"/>
+          <w:color w:val="221D27"/>
+        </w:rPr>
+        <w:t xml:space="preserve"> makes the manager reread unit definitions.</w:t>
+      </w:r>
+    </w:p>
+    <w:p>
+      <w:pPr>
+        <w:spacing w:after="80"/>
+        <w:ind w:left="547" w:hanging="274"/>
+      </w:pPr>
+      <w:r>
+        <w:rPr>
+          <w:rFonts w:ascii="Aptos" w:hAnsi="Aptos"/>
+          <w:color w:val="221D27"/>
+        </w:rPr>
+        <w:t xml:space="preserve">2. </w:t>
+      </w:r>
+      <w:r>
+        <w:rPr>
+          <w:rFonts w:ascii="Menlo" w:hAnsi="Menlo"/>
+          <w:color w:val="471D4F"/>
+          <w:sz w:val="18"/>
+        </w:rPr>
+        <w:t>systemctl restart demo.service</w:t>
+      </w:r>
+      <w:r>
+        <w:rPr>
+          <w:rFonts w:ascii="Aptos" w:hAnsi="Aptos"/>
+          <w:color w:val="221D27"/>
+        </w:rPr>
+        <w:t xml:space="preserve"> creates a new runtime process using the effective definition.</w:t>
+      </w:r>
+    </w:p>
+    <w:p>
+      <w:pPr>
+        <w:spacing w:after="80"/>
+        <w:ind w:left="547" w:hanging="274"/>
+      </w:pPr>
+      <w:r>
+        <w:rPr>
+          <w:rFonts w:ascii="Aptos" w:hAnsi="Aptos"/>
+          <w:color w:val="221D27"/>
+        </w:rPr>
+        <w:t xml:space="preserve">3. </w:t>
+      </w:r>
+      <w:r>
+        <w:rPr>
+          <w:rFonts w:ascii="Aptos" w:hAnsi="Aptos"/>
+          <w:color w:val="221D27"/>
+        </w:rPr>
+        <w:t>A behavioral check proves that the application observed and used the intended setting.</w:t>
+      </w:r>
+    </w:p>
+    <w:p>
+      <w:pPr>
+        <w:pStyle w:val="CourseCode"/>
+        <w:keepLines/>
+        <w:shd w:fill="35213B"/>
+      </w:pPr>
+      <w:r>
+        <w:rPr>
+          <w:rFonts w:ascii="Menlo" w:hAnsi="Menlo"/>
+          <w:color w:val="F5F0F7"/>
+          <w:sz w:val="16"/>
+        </w:rPr>
+        <w:t>sudo systemctl daemon-reload</w:t>
+        <w:br/>
+        <w:t>sudo systemctl restart demo.service</w:t>
+        <w:br/>
+        <w:t>systemctl show demo.service -p DropInPaths -p Environment</w:t>
+        <w:br/>
+        <w:t>cat /run/course-mode.txt</w:t>
+      </w:r>
+    </w:p>
+    <w:p>
+      <w:r>
+        <w:rPr>
+          <w:rFonts w:ascii="Aptos" w:hAnsi="Aptos"/>
+          <w:color w:val="221D27"/>
+        </w:rPr>
+        <w:t xml:space="preserve">The </w:t>
+      </w:r>
+      <w:r>
+        <w:rPr>
+          <w:rFonts w:ascii="Menlo" w:hAnsi="Menlo"/>
+          <w:color w:val="471D4F"/>
+          <w:sz w:val="18"/>
+        </w:rPr>
+        <w:t>Environment=</w:t>
+      </w:r>
+      <w:r>
+        <w:rPr>
+          <w:rFonts w:ascii="Aptos" w:hAnsi="Aptos"/>
+          <w:color w:val="221D27"/>
+        </w:rPr>
+        <w:t xml:space="preserve"> property supports the configuration account, while the generated file or client response proves application behavior. A successful restart alone proves neither that the correct drop-in won precedence nor that the application consumed the value.</w:t>
+      </w:r>
+    </w:p>
+    <w:p>
+      <w:pPr>
+        <w:pStyle w:val="Heading2"/>
+      </w:pPr>
+      <w:r>
+        <w:t>10.4 Rollback is part of the change design</w:t>
+      </w:r>
+    </w:p>
+    <w:p>
+      <w:r>
+        <w:rPr>
+          <w:rFonts w:ascii="Aptos" w:hAnsi="Aptos"/>
+          <w:color w:val="221D27"/>
+        </w:rPr>
+        <w:t xml:space="preserve">Before applying a drop-in, record the current effective definition and the expected postcondition. To roll back, remove only the administrator drop-in that introduced the change, run </w:t>
+      </w:r>
+      <w:r>
+        <w:rPr>
+          <w:rFonts w:ascii="Menlo" w:hAnsi="Menlo"/>
+          <w:color w:val="471D4F"/>
+          <w:sz w:val="18"/>
+        </w:rPr>
+        <w:t>daemon-reload</w:t>
+      </w:r>
+      <w:r>
+        <w:rPr>
+          <w:rFonts w:ascii="Aptos" w:hAnsi="Aptos"/>
+          <w:color w:val="221D27"/>
+        </w:rPr>
+        <w:t xml:space="preserve">, restart when required, and repeat the same declaration and behavior checks. Avoid broad deletion of an entire </w:t>
+      </w:r>
+      <w:r>
+        <w:rPr>
+          <w:rFonts w:ascii="Menlo" w:hAnsi="Menlo"/>
+          <w:color w:val="471D4F"/>
+          <w:sz w:val="18"/>
+        </w:rPr>
+        <w:t>.d</w:t>
+      </w:r>
+      <w:r>
+        <w:rPr>
+          <w:rFonts w:ascii="Aptos" w:hAnsi="Aptos"/>
+          <w:color w:val="221D27"/>
+        </w:rPr>
+        <w:t xml:space="preserve"> directory when other administrator controls may be present.</w:t>
+      </w:r>
+    </w:p>
+    <w:p>
+      <w:r>
+        <w:rPr>
+          <w:rFonts w:ascii="Aptos" w:hAnsi="Aptos"/>
+          <w:b/>
+          <w:color w:val="221D27"/>
+        </w:rPr>
+        <w:t>Fact-check result.</w:t>
+      </w:r>
+      <w:r>
+        <w:rPr>
+          <w:rFonts w:ascii="Aptos" w:hAnsi="Aptos"/>
+          <w:color w:val="221D27"/>
+        </w:rPr>
+        <w:t xml:space="preserve"> Drop-ins are the durable, reviewable mechanism for local unit overrides, but their merge behavior is directive-specific. </w:t>
+      </w:r>
+      <w:r>
+        <w:rPr>
+          <w:rFonts w:ascii="Menlo" w:hAnsi="Menlo"/>
+          <w:color w:val="471D4F"/>
+          <w:sz w:val="18"/>
+        </w:rPr>
+        <w:t>daemon-reload</w:t>
+      </w:r>
+      <w:r>
+        <w:rPr>
+          <w:rFonts w:ascii="Aptos" w:hAnsi="Aptos"/>
+          <w:color w:val="221D27"/>
+        </w:rPr>
+        <w:t>, service restart, and behavioral verification remain independent steps.</w:t>
+      </w:r>
+    </w:p>
+    <w:p>
+      <w:pPr>
+        <w:pStyle w:val="Heading1"/>
+      </w:pPr>
+      <w:r>
+        <w:t>11. Fact-check summary and corrections to retain</w:t>
+      </w:r>
+    </w:p>
+    <w:p>
+      <w:r>
+        <w:rPr>
+          <w:rFonts w:ascii="Aptos" w:hAnsi="Aptos"/>
+          <w:color w:val="221D27"/>
+        </w:rPr>
+        <w:t>The underlying course theory is technically strong. The review did not find a need to change the course’s operational model, but these qualifications are important:</w:t>
+      </w:r>
+    </w:p>
+    <w:p>
+      <w:pPr>
+        <w:pStyle w:val="ListBullet"/>
+      </w:pPr>
+      <w:r>
+        <w:rPr>
+          <w:rFonts w:ascii="Aptos" w:hAnsi="Aptos"/>
+          <w:color w:val="221D27"/>
+        </w:rPr>
+        <w:t xml:space="preserve"> </w:t>
+      </w:r>
+      <w:r>
+        <w:rPr>
+          <w:rFonts w:ascii="Aptos" w:hAnsi="Aptos"/>
+          <w:color w:val="221D27"/>
+        </w:rPr>
+        <w:t>“Linux” is not one distribution; package, service, and policy details must be labeled.</w:t>
+      </w:r>
+    </w:p>
+    <w:p>
+      <w:pPr>
+        <w:pStyle w:val="ListBullet"/>
+      </w:pPr>
+      <w:r>
+        <w:rPr>
+          <w:rFonts w:ascii="Aptos" w:hAnsi="Aptos"/>
+          <w:color w:val="221D27"/>
+        </w:rPr>
+        <w:t xml:space="preserve"> </w:t>
+      </w:r>
+      <w:r>
+        <w:rPr>
+          <w:rFonts w:ascii="Aptos" w:hAnsi="Aptos"/>
+          <w:color w:val="221D27"/>
+        </w:rPr>
+        <w:t>VM isolation is not unconditionally stronger; configuration and threat model matter.</w:t>
+      </w:r>
+    </w:p>
+    <w:p>
+      <w:pPr>
+        <w:pStyle w:val="ListBullet"/>
+      </w:pPr>
+      <w:r>
+        <w:rPr>
+          <w:rFonts w:ascii="Aptos" w:hAnsi="Aptos"/>
+          <w:color w:val="221D27"/>
+        </w:rPr>
+        <w:t xml:space="preserve"> </w:t>
+      </w:r>
+      <w:r>
+        <w:rPr>
+          <w:rFonts w:ascii="Menlo" w:hAnsi="Menlo"/>
+          <w:color w:val="471D4F"/>
+          <w:sz w:val="18"/>
+        </w:rPr>
+        <w:t>~</w:t>
+      </w:r>
+      <w:r>
+        <w:rPr>
+          <w:rFonts w:ascii="Aptos" w:hAnsi="Aptos"/>
+          <w:color w:val="221D27"/>
+        </w:rPr>
+        <w:t xml:space="preserve"> is expanded by the shell, not resolved as a literal filesystem component.</w:t>
+      </w:r>
+    </w:p>
+    <w:p>
+      <w:pPr>
+        <w:pStyle w:val="ListBullet"/>
+      </w:pPr>
+      <w:r>
+        <w:rPr>
+          <w:rFonts w:ascii="Aptos" w:hAnsi="Aptos"/>
+          <w:color w:val="221D27"/>
+        </w:rPr>
+        <w:t xml:space="preserve"> </w:t>
+      </w:r>
+      <w:r>
+        <w:rPr>
+          <w:rFonts w:ascii="Aptos" w:hAnsi="Aptos"/>
+          <w:color w:val="221D27"/>
+        </w:rPr>
+        <w:t xml:space="preserve">Bash pipeline status comes from the final command unless </w:t>
+      </w:r>
+      <w:r>
+        <w:rPr>
+          <w:rFonts w:ascii="Menlo" w:hAnsi="Menlo"/>
+          <w:color w:val="471D4F"/>
+          <w:sz w:val="18"/>
+        </w:rPr>
+        <w:t>pipefail</w:t>
+      </w:r>
+      <w:r>
+        <w:rPr>
+          <w:rFonts w:ascii="Aptos" w:hAnsi="Aptos"/>
+          <w:color w:val="221D27"/>
+        </w:rPr>
+        <w:t xml:space="preserve"> is enabled.</w:t>
+      </w:r>
+    </w:p>
+    <w:p>
+      <w:pPr>
+        <w:pStyle w:val="ListBullet"/>
+      </w:pPr>
+      <w:r>
+        <w:rPr>
+          <w:rFonts w:ascii="Aptos" w:hAnsi="Aptos"/>
+          <w:color w:val="221D27"/>
+        </w:rPr>
+        <w:t xml:space="preserve"> </w:t>
+      </w:r>
+      <w:r>
+        <w:rPr>
+          <w:rFonts w:ascii="Menlo" w:hAnsi="Menlo"/>
+          <w:color w:val="471D4F"/>
+          <w:sz w:val="18"/>
+        </w:rPr>
+        <w:t>/etc/passwd</w:t>
+      </w:r>
+      <w:r>
+        <w:rPr>
+          <w:rFonts w:ascii="Aptos" w:hAnsi="Aptos"/>
+          <w:color w:val="221D27"/>
+        </w:rPr>
+        <w:t xml:space="preserve"> is not necessarily the complete identity source; use NSS-aware tools.</w:t>
+      </w:r>
+    </w:p>
+    <w:p>
+      <w:pPr>
+        <w:pStyle w:val="ListBullet"/>
+      </w:pPr>
+      <w:r>
+        <w:rPr>
+          <w:rFonts w:ascii="Aptos" w:hAnsi="Aptos"/>
+          <w:color w:val="221D27"/>
+        </w:rPr>
+        <w:t xml:space="preserve"> </w:t>
+      </w:r>
+      <w:r>
+        <w:rPr>
+          <w:rFonts w:ascii="Aptos" w:hAnsi="Aptos"/>
+          <w:color w:val="221D27"/>
+        </w:rPr>
+        <w:t>Deleting a file depends chiefly on parent-directory permissions, plus other controls.</w:t>
+      </w:r>
+    </w:p>
+    <w:p>
+      <w:pPr>
+        <w:pStyle w:val="ListBullet"/>
+      </w:pPr>
+      <w:r>
+        <w:rPr>
+          <w:rFonts w:ascii="Aptos" w:hAnsi="Aptos"/>
+          <w:color w:val="221D27"/>
+        </w:rPr>
+        <w:t xml:space="preserve"> </w:t>
+      </w:r>
+      <w:r>
+        <w:rPr>
+          <w:rFonts w:ascii="Menlo" w:hAnsi="Menlo"/>
+          <w:color w:val="471D4F"/>
+          <w:sz w:val="18"/>
+        </w:rPr>
+        <w:t>apt purge</w:t>
+      </w:r>
+      <w:r>
+        <w:rPr>
+          <w:rFonts w:ascii="Aptos" w:hAnsi="Aptos"/>
+          <w:color w:val="221D27"/>
+        </w:rPr>
+        <w:t xml:space="preserve"> does not guarantee erasure of all application or user-created data.</w:t>
+      </w:r>
+    </w:p>
+    <w:p>
+      <w:pPr>
+        <w:pStyle w:val="ListBullet"/>
+      </w:pPr>
+      <w:r>
+        <w:rPr>
+          <w:rFonts w:ascii="Aptos" w:hAnsi="Aptos"/>
+          <w:color w:val="221D27"/>
+        </w:rPr>
+        <w:t xml:space="preserve"> </w:t>
+      </w:r>
+      <w:r>
+        <w:rPr>
+          <w:rFonts w:ascii="Aptos" w:hAnsi="Aptos"/>
+          <w:color w:val="221D27"/>
+        </w:rPr>
+        <w:t>First-contact SSH key acceptance does not independently verify server identity.</w:t>
+      </w:r>
+    </w:p>
+    <w:p>
+      <w:pPr>
+        <w:pStyle w:val="ListBullet"/>
+      </w:pPr>
+      <w:r>
+        <w:rPr>
+          <w:rFonts w:ascii="Aptos" w:hAnsi="Aptos"/>
+          <w:color w:val="221D27"/>
+        </w:rPr>
+        <w:t xml:space="preserve"> </w:t>
+      </w:r>
+      <w:r>
+        <w:rPr>
+          <w:rFonts w:ascii="Menlo" w:hAnsi="Menlo"/>
+          <w:color w:val="471D4F"/>
+          <w:sz w:val="18"/>
+        </w:rPr>
+        <w:t>ssh-keyscan</w:t>
+      </w:r>
+      <w:r>
+        <w:rPr>
+          <w:rFonts w:ascii="Aptos" w:hAnsi="Aptos"/>
+          <w:color w:val="221D27"/>
+        </w:rPr>
+        <w:t xml:space="preserve"> collects a key but does not authenticate it.</w:t>
+      </w:r>
+    </w:p>
+    <w:p>
+      <w:pPr>
+        <w:pStyle w:val="ListBullet"/>
+      </w:pPr>
+      <w:r>
+        <w:rPr>
+          <w:rFonts w:ascii="Aptos" w:hAnsi="Aptos"/>
+          <w:color w:val="221D27"/>
+        </w:rPr>
+        <w:t xml:space="preserve"> </w:t>
+      </w:r>
+      <w:r>
+        <w:rPr>
+          <w:rFonts w:ascii="Aptos" w:hAnsi="Aptos"/>
+          <w:color w:val="221D27"/>
+        </w:rPr>
+        <w:t>Previous-boot journal data exists only if it was retained.</w:t>
+      </w:r>
+    </w:p>
+    <w:p>
+      <w:pPr>
+        <w:pStyle w:val="ListBullet"/>
+      </w:pPr>
+      <w:r>
+        <w:rPr>
+          <w:rFonts w:ascii="Aptos" w:hAnsi="Aptos"/>
+          <w:color w:val="221D27"/>
+        </w:rPr>
+        <w:t xml:space="preserve"> </w:t>
+      </w:r>
+      <w:r>
+        <w:rPr>
+          <w:rFonts w:ascii="Aptos" w:hAnsi="Aptos"/>
+          <w:color w:val="221D27"/>
+        </w:rPr>
+        <w:t>systemd vendor-unit paths vary; inspect the effective unit instead of assuming a path.</w:t>
+      </w:r>
+    </w:p>
+    <w:p>
+      <w:pPr>
+        <w:pStyle w:val="ListBullet"/>
+      </w:pPr>
+      <w:r>
+        <w:rPr>
+          <w:rFonts w:ascii="Aptos" w:hAnsi="Aptos"/>
+          <w:color w:val="221D27"/>
+        </w:rPr>
+        <w:t xml:space="preserve"> </w:t>
+      </w:r>
+      <w:r>
+        <w:rPr>
+          <w:rFonts w:ascii="Menlo" w:hAnsi="Menlo"/>
+          <w:color w:val="471D4F"/>
+          <w:sz w:val="18"/>
+        </w:rPr>
+        <w:t>enabled</w:t>
+      </w:r>
+      <w:r>
+        <w:rPr>
+          <w:rFonts w:ascii="Aptos" w:hAnsi="Aptos"/>
+          <w:color w:val="221D27"/>
+        </w:rPr>
+        <w:t xml:space="preserve">, </w:t>
+      </w:r>
+      <w:r>
+        <w:rPr>
+          <w:rFonts w:ascii="Menlo" w:hAnsi="Menlo"/>
+          <w:color w:val="471D4F"/>
+          <w:sz w:val="18"/>
+        </w:rPr>
+        <w:t>active</w:t>
+      </w:r>
+      <w:r>
+        <w:rPr>
+          <w:rFonts w:ascii="Aptos" w:hAnsi="Aptos"/>
+          <w:color w:val="221D27"/>
+        </w:rPr>
+        <w:t>, and behaviorally healthy are independent facts.</w:t>
+      </w:r>
+    </w:p>
+    <w:p>
+      <w:pPr>
+        <w:pStyle w:val="ListBullet"/>
+      </w:pPr>
+      <w:r>
+        <w:rPr>
+          <w:rFonts w:ascii="Aptos" w:hAnsi="Aptos"/>
+          <w:color w:val="221D27"/>
+        </w:rPr>
+        <w:t xml:space="preserve"> </w:t>
+      </w:r>
+      <w:r>
+        <w:rPr>
+          <w:rFonts w:ascii="Aptos" w:hAnsi="Aptos"/>
+          <w:color w:val="221D27"/>
+        </w:rPr>
+        <w:t>A PID, a listening socket, and a successful protocol request are independent evidence.</w:t>
+      </w:r>
+    </w:p>
+    <w:p>
+      <w:pPr>
+        <w:pStyle w:val="ListBullet"/>
+      </w:pPr>
+      <w:r>
+        <w:rPr>
+          <w:rFonts w:ascii="Aptos" w:hAnsi="Aptos"/>
+          <w:color w:val="221D27"/>
+        </w:rPr>
+        <w:t xml:space="preserve"> </w:t>
+      </w:r>
+      <w:r>
+        <w:rPr>
+          <w:rFonts w:ascii="Menlo" w:hAnsi="Menlo"/>
+          <w:color w:val="471D4F"/>
+          <w:sz w:val="18"/>
+        </w:rPr>
+        <w:t>/proc/PID/cmdline</w:t>
+      </w:r>
+      <w:r>
+        <w:rPr>
+          <w:rFonts w:ascii="Aptos" w:hAnsi="Aptos"/>
+          <w:color w:val="221D27"/>
+        </w:rPr>
+        <w:t xml:space="preserve"> is NUL-separated supporting data, not an unforgeable identity record.</w:t>
+      </w:r>
+    </w:p>
+    <w:p>
+      <w:pPr>
+        <w:pStyle w:val="ListBullet"/>
+      </w:pPr>
+      <w:r>
+        <w:rPr>
+          <w:rFonts w:ascii="Aptos" w:hAnsi="Aptos"/>
+          <w:color w:val="221D27"/>
+        </w:rPr>
+        <w:t xml:space="preserve"> </w:t>
+      </w:r>
+      <w:r>
+        <w:rPr>
+          <w:rFonts w:ascii="Aptos" w:hAnsi="Aptos"/>
+          <w:color w:val="221D27"/>
+        </w:rPr>
+        <w:t>systemd drop-in merge behavior depends on the specific directive.</w:t>
+      </w:r>
+    </w:p>
+    <w:p>
+      <w:pPr>
+        <w:pStyle w:val="ListBullet"/>
+      </w:pPr>
+      <w:r>
+        <w:rPr>
+          <w:rFonts w:ascii="Aptos" w:hAnsi="Aptos"/>
+          <w:color w:val="221D27"/>
+        </w:rPr>
+        <w:t xml:space="preserve"> </w:t>
+      </w:r>
+      <w:r>
+        <w:rPr>
+          <w:rFonts w:ascii="Menlo" w:hAnsi="Menlo"/>
+          <w:color w:val="471D4F"/>
+          <w:sz w:val="18"/>
+        </w:rPr>
+        <w:t>daemon-reload</w:t>
+      </w:r>
+      <w:r>
+        <w:rPr>
+          <w:rFonts w:ascii="Aptos" w:hAnsi="Aptos"/>
+          <w:color w:val="221D27"/>
+        </w:rPr>
+        <w:t>, restart, and application behavior prove different state transitions.</w:t>
+      </w:r>
+    </w:p>
+    <w:p>
+      <w:pPr>
+        <w:pStyle w:val="Heading1"/>
+      </w:pPr>
+      <w:r>
+        <w:t>12. Command quick reference</w:t>
       </w:r>
     </w:p>
     <w:p>
@@ -5619,6 +6683,21 @@
         <w:t>systemctl is-active UNIT</w:t>
         <w:br/>
         <w:t>systemctl is-enabled UNIT</w:t>
+        <w:br/>
+        <w:br/>
+        <w:t># Process, socket, and drop-in evidence</w:t>
+        <w:br/>
+        <w:t>systemctl show UNIT -p MainPID -p ExecStart</w:t>
+        <w:br/>
+        <w:t>ps -o pid,ppid,user,stat,cmd -p PID</w:t>
+        <w:br/>
+        <w:t>sudo ss -ltnp 'sport = :PORT'</w:t>
+        <w:br/>
+        <w:t>curl --fail --show-error http://127.0.0.1:PORT/</w:t>
+        <w:br/>
+        <w:t>systemctl edit UNIT</w:t>
+        <w:br/>
+        <w:t>sudo systemctl daemon-reload</w:t>
       </w:r>
     </w:p>
     <w:p>
@@ -6038,12 +7117,22 @@
       </w:hyperlink>
     </w:p>
     <w:p>
-      <w:pPr>
-        <w:pStyle w:val="Heading1"/>
-      </w:pPr>
-      <w:r>
-        <w:t>Review provenance</w:t>
-      </w:r>
+      <w:r>
+        <w:rPr>
+          <w:rFonts w:ascii="Aptos" w:hAnsi="Aptos"/>
+          <w:color w:val="221D27"/>
+        </w:rPr>
+        <w:t xml:space="preserve">[21] Linux man-pages project, *proc_pid_cmdline(5)*: </w:t>
+      </w:r>
+      <w:hyperlink r:id="rId33">
+        <w:r>
+          <w:rPr>
+            <w:color w:val="6950B8"/>
+            <w:u w:val="single"/>
+          </w:rPr>
+          <w:t>https://man7.org/linux/man-pages/man5/proc_pid_cmdline.5.html</w:t>
+        </w:r>
+      </w:hyperlink>
     </w:p>
     <w:p>
       <w:r>
@@ -6051,7 +7140,67 @@
           <w:rFonts w:ascii="Aptos" w:hAnsi="Aptos"/>
           <w:color w:val="221D27"/>
         </w:rPr>
-        <w:t xml:space="preserve">Technical claims were checked against primary upstream manuals and current Ubuntu Server documentation on 18 July 2026. The course’s open-source inspiration remains attributed separately in </w:t>
+        <w:t xml:space="preserve">[22] Linux man-pages project, *ss(8)*: </w:t>
+      </w:r>
+      <w:hyperlink r:id="rId34">
+        <w:r>
+          <w:rPr>
+            <w:color w:val="6950B8"/>
+            <w:u w:val="single"/>
+          </w:rPr>
+          <w:t>https://man7.org/linux/man-pages/man8/ss.8.html</w:t>
+        </w:r>
+      </w:hyperlink>
+    </w:p>
+    <w:p>
+      <w:r>
+        <w:rPr>
+          <w:rFonts w:ascii="Aptos" w:hAnsi="Aptos"/>
+          <w:color w:val="221D27"/>
+        </w:rPr>
+        <w:t xml:space="preserve">[23] systemd, *systemd.service(5)* and *systemd.exec(5)*: </w:t>
+      </w:r>
+      <w:hyperlink r:id="rId35">
+        <w:r>
+          <w:rPr>
+            <w:color w:val="6950B8"/>
+            <w:u w:val="single"/>
+          </w:rPr>
+          <w:t>https://www.freedesktop.org/software/systemd/man/latest/systemd.service.html</w:t>
+        </w:r>
+      </w:hyperlink>
+      <w:r>
+        <w:rPr>
+          <w:rFonts w:ascii="Aptos" w:hAnsi="Aptos"/>
+          <w:color w:val="221D27"/>
+        </w:rPr>
+        <w:t xml:space="preserve"> and </w:t>
+      </w:r>
+      <w:hyperlink r:id="rId36">
+        <w:r>
+          <w:rPr>
+            <w:color w:val="6950B8"/>
+            <w:u w:val="single"/>
+          </w:rPr>
+          <w:t>https://www.freedesktop.org/software/systemd/man/latest/systemd.exec.html</w:t>
+        </w:r>
+      </w:hyperlink>
+    </w:p>
+    <w:p>
+      <w:pPr>
+        <w:pStyle w:val="Heading1"/>
+      </w:pPr>
+      <w:r>
+        <w:t>Review provenance</w:t>
+      </w:r>
+    </w:p>
+    <w:p>
+      <w:r>
+        <w:rPr>
+          <w:rFonts w:ascii="Aptos" w:hAnsi="Aptos"/>
+          <w:color w:val="221D27"/>
+        </w:rPr>
+        <w:t xml:space="preserve">Technical claims were checked against primary upstream manuals and current Ubuntu Server documentation on 19 July 2026. The course’s open-source inspiration remains attributed separately in </w:t>
       </w:r>
       <w:r>
         <w:rPr>

</xml_diff>